<commit_message>
Add pytest tests for get_hostname (happy path + missing fallback)
</commit_message>
<xml_diff>
--- a/Blog/Network Automation Blog.docx
+++ b/Blog/Network Automation Blog.docx
@@ -25,7 +25,23 @@
         <w:t xml:space="preserve"> point: </w:t>
       </w:r>
       <w:r>
-        <w:t xml:space="preserve"> logging.basicConfig(level=logging.INFO,format="%(asctime)s %(levelname)s %(message)s")</w:t>
+        <w:t xml:space="preserve"> </w:t>
+      </w:r>
+      <w:proofErr w:type="gramStart"/>
+      <w:r>
+        <w:t>logging.basicConfig</w:t>
+      </w:r>
+      <w:proofErr w:type="gramEnd"/>
+      <w:r>
+        <w:t>(</w:t>
+      </w:r>
+      <w:proofErr w:type="gramStart"/>
+      <w:r>
+        <w:t>level=logging.INFO,format</w:t>
+      </w:r>
+      <w:proofErr w:type="gramEnd"/>
+      <w:r>
+        <w:t>="%(asctime)s %(levelname)s %(message)s")</w:t>
       </w:r>
     </w:p>
     <w:p/>
@@ -51,7 +67,15 @@
     <w:p/>
     <w:p>
       <w:r>
-        <w:t>logger = logging.getLogger(__name__) #just grab a logger to talk to, not configured anything yet</w:t>
+        <w:t xml:space="preserve">logger = </w:t>
+      </w:r>
+      <w:proofErr w:type="gramStart"/>
+      <w:r>
+        <w:t>logging.getLogger</w:t>
+      </w:r>
+      <w:proofErr w:type="gramEnd"/>
+      <w:r>
+        <w:t>(__name__) #just grab a logger to talk to, not configured anything yet</w:t>
       </w:r>
     </w:p>
     <w:p/>
@@ -1140,8 +1164,848 @@
       <w:r>
         <w:t xml:space="preserve">: </w:t>
       </w:r>
-      <w:r>
-        <w:t>logger.error(f"failed to open '{filename}' : {e}")</w:t>
+      <w:proofErr w:type="gramStart"/>
+      <w:r>
+        <w:t>logger.error</w:t>
+      </w:r>
+      <w:proofErr w:type="gramEnd"/>
+      <w:r>
+        <w:t>(f"failed to open '{filename}</w:t>
+      </w:r>
+      <w:proofErr w:type="gramStart"/>
+      <w:r>
+        <w:t>' :</w:t>
+      </w:r>
+      <w:proofErr w:type="gramEnd"/>
+      <w:r>
+        <w:t xml:space="preserve"> {e}")</w:t>
+      </w:r>
+    </w:p>
+    <w:p/>
+    <w:p>
+      <w:r>
+        <w:t xml:space="preserve">interesting lazy formatting: </w:t>
+      </w:r>
+      <w:r>
+        <w:t xml:space="preserve"> </w:t>
+      </w:r>
+      <w:proofErr w:type="gramStart"/>
+      <w:r>
+        <w:t>logger.debug</w:t>
+      </w:r>
+      <w:proofErr w:type="gramEnd"/>
+      <w:r>
+        <w:t>(" file %s with hostname %s has %s interfaces and %d OSPF networks", filename, hostname, len(interface), len(ospf))</w:t>
+      </w:r>
+    </w:p>
+    <w:p/>
+    <w:p>
+      <w:pPr>
+        <w:rPr>
+          <w:u w:val="single"/>
+        </w:rPr>
+      </w:pPr>
+      <w:r>
+        <w:rPr>
+          <w:u w:val="single"/>
+        </w:rPr>
+        <w:t>Session 10: PYTEST</w:t>
+      </w:r>
+    </w:p>
+    <w:p/>
+    <w:p>
+      <w:r>
+        <w:t>Testing is important part of network automation journey.</w:t>
+      </w:r>
+    </w:p>
+    <w:p/>
+    <w:p>
+      <w:pPr>
+        <w:rPr>
+          <w:u w:val="single"/>
+        </w:rPr>
+      </w:pPr>
+      <w:r>
+        <w:t xml:space="preserve">A test gives a function a </w:t>
+      </w:r>
+      <w:r>
+        <w:rPr>
+          <w:u w:val="single"/>
+        </w:rPr>
+        <w:t>known input</w:t>
+      </w:r>
+      <w:r>
+        <w:t xml:space="preserve">, then checks that it returns the </w:t>
+      </w:r>
+      <w:r>
+        <w:rPr>
+          <w:u w:val="single"/>
+        </w:rPr>
+        <w:t>output you expect.</w:t>
+      </w:r>
+    </w:p>
+    <w:p>
+      <w:pPr>
+        <w:rPr>
+          <w:u w:val="single"/>
+        </w:rPr>
+      </w:pPr>
+    </w:p>
+    <w:p>
+      <w:r>
+        <w:t>Test functions take no arguments.</w:t>
+      </w:r>
+    </w:p>
+    <w:p/>
+    <w:p>
+      <w:r>
+        <w:t>ok, so i was missing a list as input and that list was fed into get_hotname function which then was stored in result and matched with actual R1 output.</w:t>
+      </w:r>
+    </w:p>
+    <w:p/>
+    <w:p>
+      <w:pPr>
+        <w:shd w:val="clear" w:color="auto" w:fill="181818"/>
+        <w:spacing w:line="270" w:lineRule="atLeast"/>
+        <w:rPr>
+          <w:rFonts w:ascii="Menlo" w:eastAsia="Times New Roman" w:hAnsi="Menlo" w:cs="Menlo"/>
+          <w:color w:val="E4E4E4"/>
+          <w:kern w:val="0"/>
+          <w:sz w:val="18"/>
+          <w:szCs w:val="18"/>
+          <w:lang w:val="en-IN" w:eastAsia="en-GB"/>
+          <w14:ligatures w14:val="none"/>
+        </w:rPr>
+      </w:pPr>
+      <w:r>
+        <w:rPr>
+          <w:rFonts w:ascii="Menlo" w:eastAsia="Times New Roman" w:hAnsi="Menlo" w:cs="Menlo"/>
+          <w:i/>
+          <w:iCs/>
+          <w:color w:val="82D2CE"/>
+          <w:kern w:val="0"/>
+          <w:sz w:val="18"/>
+          <w:szCs w:val="18"/>
+          <w:lang w:val="en-IN" w:eastAsia="en-GB"/>
+          <w14:ligatures w14:val="none"/>
+        </w:rPr>
+        <w:t>from</w:t>
+      </w:r>
+      <w:r>
+        <w:rPr>
+          <w:rFonts w:ascii="Menlo" w:eastAsia="Times New Roman" w:hAnsi="Menlo" w:cs="Menlo"/>
+          <w:color w:val="E4E4E4"/>
+          <w:kern w:val="0"/>
+          <w:sz w:val="18"/>
+          <w:szCs w:val="18"/>
+          <w:lang w:val="en-IN" w:eastAsia="en-GB"/>
+          <w14:ligatures w14:val="none"/>
+        </w:rPr>
+        <w:t xml:space="preserve"> </w:t>
+      </w:r>
+      <w:r>
+        <w:rPr>
+          <w:rFonts w:ascii="Menlo" w:eastAsia="Times New Roman" w:hAnsi="Menlo" w:cs="Menlo"/>
+          <w:color w:val="CCCCCC"/>
+          <w:kern w:val="0"/>
+          <w:sz w:val="18"/>
+          <w:szCs w:val="18"/>
+          <w:lang w:val="en-IN" w:eastAsia="en-GB"/>
+          <w14:ligatures w14:val="none"/>
+        </w:rPr>
+        <w:t>config_analyzer</w:t>
+      </w:r>
+      <w:r>
+        <w:rPr>
+          <w:rFonts w:ascii="Menlo" w:eastAsia="Times New Roman" w:hAnsi="Menlo" w:cs="Menlo"/>
+          <w:color w:val="E4E4E4"/>
+          <w:kern w:val="0"/>
+          <w:sz w:val="18"/>
+          <w:szCs w:val="18"/>
+          <w:lang w:val="en-IN" w:eastAsia="en-GB"/>
+          <w14:ligatures w14:val="none"/>
+        </w:rPr>
+        <w:t xml:space="preserve"> </w:t>
+      </w:r>
+      <w:r>
+        <w:rPr>
+          <w:rFonts w:ascii="Menlo" w:eastAsia="Times New Roman" w:hAnsi="Menlo" w:cs="Menlo"/>
+          <w:i/>
+          <w:iCs/>
+          <w:color w:val="82D2CE"/>
+          <w:kern w:val="0"/>
+          <w:sz w:val="18"/>
+          <w:szCs w:val="18"/>
+          <w:lang w:val="en-IN" w:eastAsia="en-GB"/>
+          <w14:ligatures w14:val="none"/>
+        </w:rPr>
+        <w:t>import</w:t>
+      </w:r>
+      <w:r>
+        <w:rPr>
+          <w:rFonts w:ascii="Menlo" w:eastAsia="Times New Roman" w:hAnsi="Menlo" w:cs="Menlo"/>
+          <w:color w:val="E4E4E4"/>
+          <w:kern w:val="0"/>
+          <w:sz w:val="18"/>
+          <w:szCs w:val="18"/>
+          <w:lang w:val="en-IN" w:eastAsia="en-GB"/>
+          <w14:ligatures w14:val="none"/>
+        </w:rPr>
+        <w:t xml:space="preserve"> </w:t>
+      </w:r>
+      <w:r>
+        <w:rPr>
+          <w:rFonts w:ascii="Menlo" w:eastAsia="Times New Roman" w:hAnsi="Menlo" w:cs="Menlo"/>
+          <w:color w:val="EBC88D"/>
+          <w:kern w:val="0"/>
+          <w:sz w:val="18"/>
+          <w:szCs w:val="18"/>
+          <w:lang w:val="en-IN" w:eastAsia="en-GB"/>
+          <w14:ligatures w14:val="none"/>
+        </w:rPr>
+        <w:t>get_hostname</w:t>
+      </w:r>
+    </w:p>
+    <w:p>
+      <w:pPr>
+        <w:shd w:val="clear" w:color="auto" w:fill="181818"/>
+        <w:spacing w:line="270" w:lineRule="atLeast"/>
+        <w:rPr>
+          <w:rFonts w:ascii="Menlo" w:eastAsia="Times New Roman" w:hAnsi="Menlo" w:cs="Menlo"/>
+          <w:color w:val="E4E4E4"/>
+          <w:kern w:val="0"/>
+          <w:sz w:val="18"/>
+          <w:szCs w:val="18"/>
+          <w:lang w:val="en-IN" w:eastAsia="en-GB"/>
+          <w14:ligatures w14:val="none"/>
+        </w:rPr>
+      </w:pPr>
+    </w:p>
+    <w:p>
+      <w:pPr>
+        <w:shd w:val="clear" w:color="auto" w:fill="181818"/>
+        <w:spacing w:line="270" w:lineRule="atLeast"/>
+        <w:rPr>
+          <w:rFonts w:ascii="Menlo" w:eastAsia="Times New Roman" w:hAnsi="Menlo" w:cs="Menlo"/>
+          <w:color w:val="E4E4E4"/>
+          <w:kern w:val="0"/>
+          <w:sz w:val="18"/>
+          <w:szCs w:val="18"/>
+          <w:lang w:val="en-IN" w:eastAsia="en-GB"/>
+          <w14:ligatures w14:val="none"/>
+        </w:rPr>
+      </w:pPr>
+      <w:r>
+        <w:rPr>
+          <w:rFonts w:ascii="Menlo" w:eastAsia="Times New Roman" w:hAnsi="Menlo" w:cs="Menlo"/>
+          <w:color w:val="82D2CE"/>
+          <w:kern w:val="0"/>
+          <w:sz w:val="18"/>
+          <w:szCs w:val="18"/>
+          <w:lang w:val="en-IN" w:eastAsia="en-GB"/>
+          <w14:ligatures w14:val="none"/>
+        </w:rPr>
+        <w:t>def</w:t>
+      </w:r>
+      <w:r>
+        <w:rPr>
+          <w:rFonts w:ascii="Menlo" w:eastAsia="Times New Roman" w:hAnsi="Menlo" w:cs="Menlo"/>
+          <w:color w:val="E4E4E4"/>
+          <w:kern w:val="0"/>
+          <w:sz w:val="18"/>
+          <w:szCs w:val="18"/>
+          <w:lang w:val="en-IN" w:eastAsia="en-GB"/>
+          <w14:ligatures w14:val="none"/>
+        </w:rPr>
+        <w:t xml:space="preserve"> </w:t>
+      </w:r>
+      <w:r>
+        <w:rPr>
+          <w:rFonts w:ascii="Menlo" w:eastAsia="Times New Roman" w:hAnsi="Menlo" w:cs="Menlo"/>
+          <w:b/>
+          <w:bCs/>
+          <w:color w:val="EFB080"/>
+          <w:kern w:val="0"/>
+          <w:sz w:val="18"/>
+          <w:szCs w:val="18"/>
+          <w:lang w:val="en-IN" w:eastAsia="en-GB"/>
+          <w14:ligatures w14:val="none"/>
+        </w:rPr>
+        <w:t>test_get_hostname</w:t>
+      </w:r>
+      <w:r>
+        <w:rPr>
+          <w:rFonts w:ascii="Menlo" w:eastAsia="Times New Roman" w:hAnsi="Menlo" w:cs="Menlo"/>
+          <w:color w:val="E4E4E4"/>
+          <w:kern w:val="0"/>
+          <w:sz w:val="18"/>
+          <w:szCs w:val="18"/>
+          <w:lang w:val="en-IN" w:eastAsia="en-GB"/>
+          <w14:ligatures w14:val="none"/>
+        </w:rPr>
+        <w:t>():</w:t>
+      </w:r>
+    </w:p>
+    <w:p>
+      <w:pPr>
+        <w:shd w:val="clear" w:color="auto" w:fill="181818"/>
+        <w:spacing w:line="270" w:lineRule="atLeast"/>
+        <w:rPr>
+          <w:rFonts w:ascii="Menlo" w:eastAsia="Times New Roman" w:hAnsi="Menlo" w:cs="Menlo"/>
+          <w:color w:val="E4E4E4"/>
+          <w:kern w:val="0"/>
+          <w:sz w:val="18"/>
+          <w:szCs w:val="18"/>
+          <w:lang w:val="en-IN" w:eastAsia="en-GB"/>
+          <w14:ligatures w14:val="none"/>
+        </w:rPr>
+      </w:pPr>
+      <w:r>
+        <w:rPr>
+          <w:rFonts w:ascii="Menlo" w:eastAsia="Times New Roman" w:hAnsi="Menlo" w:cs="Menlo"/>
+          <w:color w:val="E4E4E4"/>
+          <w:kern w:val="0"/>
+          <w:sz w:val="18"/>
+          <w:szCs w:val="18"/>
+          <w:lang w:val="en-IN" w:eastAsia="en-GB"/>
+          <w14:ligatures w14:val="none"/>
+        </w:rPr>
+        <w:t xml:space="preserve">    </w:t>
+      </w:r>
+      <w:r>
+        <w:rPr>
+          <w:rFonts w:ascii="Menlo" w:eastAsia="Times New Roman" w:hAnsi="Menlo" w:cs="Menlo"/>
+          <w:color w:val="87C3FF"/>
+          <w:kern w:val="0"/>
+          <w:sz w:val="18"/>
+          <w:szCs w:val="18"/>
+          <w:lang w:val="en-IN" w:eastAsia="en-GB"/>
+          <w14:ligatures w14:val="none"/>
+        </w:rPr>
+        <w:t>lines</w:t>
+      </w:r>
+      <w:r>
+        <w:rPr>
+          <w:rFonts w:ascii="Menlo" w:eastAsia="Times New Roman" w:hAnsi="Menlo" w:cs="Menlo"/>
+          <w:color w:val="E4E4E4"/>
+          <w:kern w:val="0"/>
+          <w:sz w:val="18"/>
+          <w:szCs w:val="18"/>
+          <w:lang w:val="en-IN" w:eastAsia="en-GB"/>
+          <w14:ligatures w14:val="none"/>
+        </w:rPr>
+        <w:t xml:space="preserve"> </w:t>
+      </w:r>
+      <w:r>
+        <w:rPr>
+          <w:rFonts w:ascii="Menlo" w:eastAsia="Times New Roman" w:hAnsi="Menlo" w:cs="Menlo"/>
+          <w:color w:val="D6D6DD"/>
+          <w:kern w:val="0"/>
+          <w:sz w:val="18"/>
+          <w:szCs w:val="18"/>
+          <w:lang w:val="en-IN" w:eastAsia="en-GB"/>
+          <w14:ligatures w14:val="none"/>
+        </w:rPr>
+        <w:t>=</w:t>
+      </w:r>
+      <w:r>
+        <w:rPr>
+          <w:rFonts w:ascii="Menlo" w:eastAsia="Times New Roman" w:hAnsi="Menlo" w:cs="Menlo"/>
+          <w:color w:val="E4E4E4"/>
+          <w:kern w:val="0"/>
+          <w:sz w:val="18"/>
+          <w:szCs w:val="18"/>
+          <w:lang w:val="en-IN" w:eastAsia="en-GB"/>
+          <w14:ligatures w14:val="none"/>
+        </w:rPr>
+        <w:t xml:space="preserve"> </w:t>
+      </w:r>
+      <w:r>
+        <w:rPr>
+          <w:rFonts w:ascii="Menlo" w:eastAsia="Times New Roman" w:hAnsi="Menlo" w:cs="Menlo"/>
+          <w:color w:val="D6D6DD"/>
+          <w:kern w:val="0"/>
+          <w:sz w:val="18"/>
+          <w:szCs w:val="18"/>
+          <w:lang w:val="en-IN" w:eastAsia="en-GB"/>
+          <w14:ligatures w14:val="none"/>
+        </w:rPr>
+        <w:t>[</w:t>
+      </w:r>
+      <w:r>
+        <w:rPr>
+          <w:rFonts w:ascii="Menlo" w:eastAsia="Times New Roman" w:hAnsi="Menlo" w:cs="Menlo"/>
+          <w:color w:val="E394DC"/>
+          <w:kern w:val="0"/>
+          <w:sz w:val="18"/>
+          <w:szCs w:val="18"/>
+          <w:lang w:val="en-IN" w:eastAsia="en-GB"/>
+          <w14:ligatures w14:val="none"/>
+        </w:rPr>
+        <w:t>"hostname R1</w:t>
+      </w:r>
+      <w:r>
+        <w:rPr>
+          <w:rFonts w:ascii="Menlo" w:eastAsia="Times New Roman" w:hAnsi="Menlo" w:cs="Menlo"/>
+          <w:color w:val="D6D6DD"/>
+          <w:kern w:val="0"/>
+          <w:sz w:val="18"/>
+          <w:szCs w:val="18"/>
+          <w:lang w:val="en-IN" w:eastAsia="en-GB"/>
+          <w14:ligatures w14:val="none"/>
+        </w:rPr>
+        <w:t>\n</w:t>
+      </w:r>
+      <w:r>
+        <w:rPr>
+          <w:rFonts w:ascii="Menlo" w:eastAsia="Times New Roman" w:hAnsi="Menlo" w:cs="Menlo"/>
+          <w:color w:val="E394DC"/>
+          <w:kern w:val="0"/>
+          <w:sz w:val="18"/>
+          <w:szCs w:val="18"/>
+          <w:lang w:val="en-IN" w:eastAsia="en-GB"/>
+          <w14:ligatures w14:val="none"/>
+        </w:rPr>
+        <w:t>"</w:t>
+      </w:r>
+      <w:r>
+        <w:rPr>
+          <w:rFonts w:ascii="Menlo" w:eastAsia="Times New Roman" w:hAnsi="Menlo" w:cs="Menlo"/>
+          <w:color w:val="D6D6DD"/>
+          <w:kern w:val="0"/>
+          <w:sz w:val="18"/>
+          <w:szCs w:val="18"/>
+          <w:lang w:val="en-IN" w:eastAsia="en-GB"/>
+          <w14:ligatures w14:val="none"/>
+        </w:rPr>
+        <w:t>,</w:t>
+      </w:r>
+      <w:r>
+        <w:rPr>
+          <w:rFonts w:ascii="Menlo" w:eastAsia="Times New Roman" w:hAnsi="Menlo" w:cs="Menlo"/>
+          <w:color w:val="E4E4E4"/>
+          <w:kern w:val="0"/>
+          <w:sz w:val="18"/>
+          <w:szCs w:val="18"/>
+          <w:lang w:val="en-IN" w:eastAsia="en-GB"/>
+          <w14:ligatures w14:val="none"/>
+        </w:rPr>
+        <w:t xml:space="preserve"> </w:t>
+      </w:r>
+      <w:r>
+        <w:rPr>
+          <w:rFonts w:ascii="Menlo" w:eastAsia="Times New Roman" w:hAnsi="Menlo" w:cs="Menlo"/>
+          <w:color w:val="E394DC"/>
+          <w:kern w:val="0"/>
+          <w:sz w:val="18"/>
+          <w:szCs w:val="18"/>
+          <w:lang w:val="en-IN" w:eastAsia="en-GB"/>
+          <w14:ligatures w14:val="none"/>
+        </w:rPr>
+        <w:t>"!</w:t>
+      </w:r>
+      <w:r>
+        <w:rPr>
+          <w:rFonts w:ascii="Menlo" w:eastAsia="Times New Roman" w:hAnsi="Menlo" w:cs="Menlo"/>
+          <w:color w:val="D6D6DD"/>
+          <w:kern w:val="0"/>
+          <w:sz w:val="18"/>
+          <w:szCs w:val="18"/>
+          <w:lang w:val="en-IN" w:eastAsia="en-GB"/>
+          <w14:ligatures w14:val="none"/>
+        </w:rPr>
+        <w:t>\n</w:t>
+      </w:r>
+      <w:r>
+        <w:rPr>
+          <w:rFonts w:ascii="Menlo" w:eastAsia="Times New Roman" w:hAnsi="Menlo" w:cs="Menlo"/>
+          <w:color w:val="E394DC"/>
+          <w:kern w:val="0"/>
+          <w:sz w:val="18"/>
+          <w:szCs w:val="18"/>
+          <w:lang w:val="en-IN" w:eastAsia="en-GB"/>
+          <w14:ligatures w14:val="none"/>
+        </w:rPr>
+        <w:t>"</w:t>
+      </w:r>
+      <w:r>
+        <w:rPr>
+          <w:rFonts w:ascii="Menlo" w:eastAsia="Times New Roman" w:hAnsi="Menlo" w:cs="Menlo"/>
+          <w:color w:val="D6D6DD"/>
+          <w:kern w:val="0"/>
+          <w:sz w:val="18"/>
+          <w:szCs w:val="18"/>
+          <w:lang w:val="en-IN" w:eastAsia="en-GB"/>
+          <w14:ligatures w14:val="none"/>
+        </w:rPr>
+        <w:t>,</w:t>
+      </w:r>
+      <w:r>
+        <w:rPr>
+          <w:rFonts w:ascii="Menlo" w:eastAsia="Times New Roman" w:hAnsi="Menlo" w:cs="Menlo"/>
+          <w:color w:val="E4E4E4"/>
+          <w:kern w:val="0"/>
+          <w:sz w:val="18"/>
+          <w:szCs w:val="18"/>
+          <w:lang w:val="en-IN" w:eastAsia="en-GB"/>
+          <w14:ligatures w14:val="none"/>
+        </w:rPr>
+        <w:t xml:space="preserve"> </w:t>
+      </w:r>
+      <w:r>
+        <w:rPr>
+          <w:rFonts w:ascii="Menlo" w:eastAsia="Times New Roman" w:hAnsi="Menlo" w:cs="Menlo"/>
+          <w:color w:val="E394DC"/>
+          <w:kern w:val="0"/>
+          <w:sz w:val="18"/>
+          <w:szCs w:val="18"/>
+          <w:lang w:val="en-IN" w:eastAsia="en-GB"/>
+          <w14:ligatures w14:val="none"/>
+        </w:rPr>
+        <w:t>"interface GigabitEthernet0/0</w:t>
+      </w:r>
+      <w:r>
+        <w:rPr>
+          <w:rFonts w:ascii="Menlo" w:eastAsia="Times New Roman" w:hAnsi="Menlo" w:cs="Menlo"/>
+          <w:color w:val="D6D6DD"/>
+          <w:kern w:val="0"/>
+          <w:sz w:val="18"/>
+          <w:szCs w:val="18"/>
+          <w:lang w:val="en-IN" w:eastAsia="en-GB"/>
+          <w14:ligatures w14:val="none"/>
+        </w:rPr>
+        <w:t>\n</w:t>
+      </w:r>
+      <w:r>
+        <w:rPr>
+          <w:rFonts w:ascii="Menlo" w:eastAsia="Times New Roman" w:hAnsi="Menlo" w:cs="Menlo"/>
+          <w:color w:val="E394DC"/>
+          <w:kern w:val="0"/>
+          <w:sz w:val="18"/>
+          <w:szCs w:val="18"/>
+          <w:lang w:val="en-IN" w:eastAsia="en-GB"/>
+          <w14:ligatures w14:val="none"/>
+        </w:rPr>
+        <w:t>"</w:t>
+      </w:r>
+      <w:r>
+        <w:rPr>
+          <w:rFonts w:ascii="Menlo" w:eastAsia="Times New Roman" w:hAnsi="Menlo" w:cs="Menlo"/>
+          <w:color w:val="D6D6DD"/>
+          <w:kern w:val="0"/>
+          <w:sz w:val="18"/>
+          <w:szCs w:val="18"/>
+          <w:lang w:val="en-IN" w:eastAsia="en-GB"/>
+          <w14:ligatures w14:val="none"/>
+        </w:rPr>
+        <w:t>]</w:t>
+      </w:r>
+    </w:p>
+    <w:p>
+      <w:pPr>
+        <w:shd w:val="clear" w:color="auto" w:fill="181818"/>
+        <w:spacing w:line="270" w:lineRule="atLeast"/>
+        <w:rPr>
+          <w:rFonts w:ascii="Menlo" w:eastAsia="Times New Roman" w:hAnsi="Menlo" w:cs="Menlo"/>
+          <w:color w:val="E4E4E4"/>
+          <w:kern w:val="0"/>
+          <w:sz w:val="18"/>
+          <w:szCs w:val="18"/>
+          <w:lang w:val="en-IN" w:eastAsia="en-GB"/>
+          <w14:ligatures w14:val="none"/>
+        </w:rPr>
+      </w:pPr>
+      <w:r>
+        <w:rPr>
+          <w:rFonts w:ascii="Menlo" w:eastAsia="Times New Roman" w:hAnsi="Menlo" w:cs="Menlo"/>
+          <w:color w:val="E4E4E4"/>
+          <w:kern w:val="0"/>
+          <w:sz w:val="18"/>
+          <w:szCs w:val="18"/>
+          <w:lang w:val="en-IN" w:eastAsia="en-GB"/>
+          <w14:ligatures w14:val="none"/>
+        </w:rPr>
+        <w:t xml:space="preserve">    </w:t>
+      </w:r>
+      <w:r>
+        <w:rPr>
+          <w:rFonts w:ascii="Menlo" w:eastAsia="Times New Roman" w:hAnsi="Menlo" w:cs="Menlo"/>
+          <w:color w:val="87C3FF"/>
+          <w:kern w:val="0"/>
+          <w:sz w:val="18"/>
+          <w:szCs w:val="18"/>
+          <w:lang w:val="en-IN" w:eastAsia="en-GB"/>
+          <w14:ligatures w14:val="none"/>
+        </w:rPr>
+        <w:t>result</w:t>
+      </w:r>
+      <w:r>
+        <w:rPr>
+          <w:rFonts w:ascii="Menlo" w:eastAsia="Times New Roman" w:hAnsi="Menlo" w:cs="Menlo"/>
+          <w:color w:val="E4E4E4"/>
+          <w:kern w:val="0"/>
+          <w:sz w:val="18"/>
+          <w:szCs w:val="18"/>
+          <w:lang w:val="en-IN" w:eastAsia="en-GB"/>
+          <w14:ligatures w14:val="none"/>
+        </w:rPr>
+        <w:t xml:space="preserve"> </w:t>
+      </w:r>
+      <w:r>
+        <w:rPr>
+          <w:rFonts w:ascii="Menlo" w:eastAsia="Times New Roman" w:hAnsi="Menlo" w:cs="Menlo"/>
+          <w:color w:val="D6D6DD"/>
+          <w:kern w:val="0"/>
+          <w:sz w:val="18"/>
+          <w:szCs w:val="18"/>
+          <w:lang w:val="en-IN" w:eastAsia="en-GB"/>
+          <w14:ligatures w14:val="none"/>
+        </w:rPr>
+        <w:t>=</w:t>
+      </w:r>
+      <w:r>
+        <w:rPr>
+          <w:rFonts w:ascii="Menlo" w:eastAsia="Times New Roman" w:hAnsi="Menlo" w:cs="Menlo"/>
+          <w:color w:val="E4E4E4"/>
+          <w:kern w:val="0"/>
+          <w:sz w:val="18"/>
+          <w:szCs w:val="18"/>
+          <w:lang w:val="en-IN" w:eastAsia="en-GB"/>
+          <w14:ligatures w14:val="none"/>
+        </w:rPr>
+        <w:t xml:space="preserve"> </w:t>
+      </w:r>
+      <w:r>
+        <w:rPr>
+          <w:rFonts w:ascii="Menlo" w:eastAsia="Times New Roman" w:hAnsi="Menlo" w:cs="Menlo"/>
+          <w:color w:val="EBC88D"/>
+          <w:kern w:val="0"/>
+          <w:sz w:val="18"/>
+          <w:szCs w:val="18"/>
+          <w:lang w:val="en-IN" w:eastAsia="en-GB"/>
+          <w14:ligatures w14:val="none"/>
+        </w:rPr>
+        <w:t>get_hostname</w:t>
+      </w:r>
+      <w:r>
+        <w:rPr>
+          <w:rFonts w:ascii="Menlo" w:eastAsia="Times New Roman" w:hAnsi="Menlo" w:cs="Menlo"/>
+          <w:color w:val="D6D6DD"/>
+          <w:kern w:val="0"/>
+          <w:sz w:val="18"/>
+          <w:szCs w:val="18"/>
+          <w:lang w:val="en-IN" w:eastAsia="en-GB"/>
+          <w14:ligatures w14:val="none"/>
+        </w:rPr>
+        <w:t>(</w:t>
+      </w:r>
+      <w:r>
+        <w:rPr>
+          <w:rFonts w:ascii="Menlo" w:eastAsia="Times New Roman" w:hAnsi="Menlo" w:cs="Menlo"/>
+          <w:color w:val="87C3FF"/>
+          <w:kern w:val="0"/>
+          <w:sz w:val="18"/>
+          <w:szCs w:val="18"/>
+          <w:lang w:val="en-IN" w:eastAsia="en-GB"/>
+          <w14:ligatures w14:val="none"/>
+        </w:rPr>
+        <w:t>lines</w:t>
+      </w:r>
+      <w:r>
+        <w:rPr>
+          <w:rFonts w:ascii="Menlo" w:eastAsia="Times New Roman" w:hAnsi="Menlo" w:cs="Menlo"/>
+          <w:color w:val="D6D6DD"/>
+          <w:kern w:val="0"/>
+          <w:sz w:val="18"/>
+          <w:szCs w:val="18"/>
+          <w:lang w:val="en-IN" w:eastAsia="en-GB"/>
+          <w14:ligatures w14:val="none"/>
+        </w:rPr>
+        <w:t>)</w:t>
+      </w:r>
+    </w:p>
+    <w:p>
+      <w:pPr>
+        <w:shd w:val="clear" w:color="auto" w:fill="181818"/>
+        <w:spacing w:line="270" w:lineRule="atLeast"/>
+        <w:rPr>
+          <w:rFonts w:ascii="Menlo" w:eastAsia="Times New Roman" w:hAnsi="Menlo" w:cs="Menlo"/>
+          <w:color w:val="E4E4E4"/>
+          <w:kern w:val="0"/>
+          <w:sz w:val="18"/>
+          <w:szCs w:val="18"/>
+          <w:lang w:val="en-IN" w:eastAsia="en-GB"/>
+          <w14:ligatures w14:val="none"/>
+        </w:rPr>
+      </w:pPr>
+      <w:r>
+        <w:rPr>
+          <w:rFonts w:ascii="Menlo" w:eastAsia="Times New Roman" w:hAnsi="Menlo" w:cs="Menlo"/>
+          <w:color w:val="E4E4E4"/>
+          <w:kern w:val="0"/>
+          <w:sz w:val="18"/>
+          <w:szCs w:val="18"/>
+          <w:lang w:val="en-IN" w:eastAsia="en-GB"/>
+          <w14:ligatures w14:val="none"/>
+        </w:rPr>
+        <w:t xml:space="preserve">    </w:t>
+      </w:r>
+      <w:r>
+        <w:rPr>
+          <w:rFonts w:ascii="Menlo" w:eastAsia="Times New Roman" w:hAnsi="Menlo" w:cs="Menlo"/>
+          <w:i/>
+          <w:iCs/>
+          <w:color w:val="82D2CE"/>
+          <w:kern w:val="0"/>
+          <w:sz w:val="18"/>
+          <w:szCs w:val="18"/>
+          <w:lang w:val="en-IN" w:eastAsia="en-GB"/>
+          <w14:ligatures w14:val="none"/>
+        </w:rPr>
+        <w:t>assert</w:t>
+      </w:r>
+      <w:r>
+        <w:rPr>
+          <w:rFonts w:ascii="Menlo" w:eastAsia="Times New Roman" w:hAnsi="Menlo" w:cs="Menlo"/>
+          <w:color w:val="E4E4E4"/>
+          <w:kern w:val="0"/>
+          <w:sz w:val="18"/>
+          <w:szCs w:val="18"/>
+          <w:lang w:val="en-IN" w:eastAsia="en-GB"/>
+          <w14:ligatures w14:val="none"/>
+        </w:rPr>
+        <w:t xml:space="preserve"> </w:t>
+      </w:r>
+      <w:r>
+        <w:rPr>
+          <w:rFonts w:ascii="Menlo" w:eastAsia="Times New Roman" w:hAnsi="Menlo" w:cs="Menlo"/>
+          <w:color w:val="87C3FF"/>
+          <w:kern w:val="0"/>
+          <w:sz w:val="18"/>
+          <w:szCs w:val="18"/>
+          <w:lang w:val="en-IN" w:eastAsia="en-GB"/>
+          <w14:ligatures w14:val="none"/>
+        </w:rPr>
+        <w:t>result</w:t>
+      </w:r>
+      <w:r>
+        <w:rPr>
+          <w:rFonts w:ascii="Menlo" w:eastAsia="Times New Roman" w:hAnsi="Menlo" w:cs="Menlo"/>
+          <w:color w:val="E4E4E4"/>
+          <w:kern w:val="0"/>
+          <w:sz w:val="18"/>
+          <w:szCs w:val="18"/>
+          <w:lang w:val="en-IN" w:eastAsia="en-GB"/>
+          <w14:ligatures w14:val="none"/>
+        </w:rPr>
+        <w:t xml:space="preserve"> </w:t>
+      </w:r>
+      <w:r>
+        <w:rPr>
+          <w:rFonts w:ascii="Menlo" w:eastAsia="Times New Roman" w:hAnsi="Menlo" w:cs="Menlo"/>
+          <w:color w:val="D6D6DD"/>
+          <w:kern w:val="0"/>
+          <w:sz w:val="18"/>
+          <w:szCs w:val="18"/>
+          <w:lang w:val="en-IN" w:eastAsia="en-GB"/>
+          <w14:ligatures w14:val="none"/>
+        </w:rPr>
+        <w:t>==</w:t>
+      </w:r>
+      <w:r>
+        <w:rPr>
+          <w:rFonts w:ascii="Menlo" w:eastAsia="Times New Roman" w:hAnsi="Menlo" w:cs="Menlo"/>
+          <w:color w:val="E4E4E4"/>
+          <w:kern w:val="0"/>
+          <w:sz w:val="18"/>
+          <w:szCs w:val="18"/>
+          <w:lang w:val="en-IN" w:eastAsia="en-GB"/>
+          <w14:ligatures w14:val="none"/>
+        </w:rPr>
+        <w:t xml:space="preserve"> </w:t>
+      </w:r>
+      <w:r>
+        <w:rPr>
+          <w:rFonts w:ascii="Menlo" w:eastAsia="Times New Roman" w:hAnsi="Menlo" w:cs="Menlo"/>
+          <w:color w:val="E394DC"/>
+          <w:kern w:val="0"/>
+          <w:sz w:val="18"/>
+          <w:szCs w:val="18"/>
+          <w:lang w:val="en-IN" w:eastAsia="en-GB"/>
+          <w14:ligatures w14:val="none"/>
+        </w:rPr>
+        <w:t>"R1"</w:t>
+      </w:r>
+    </w:p>
+    <w:p>
+      <w:pPr>
+        <w:shd w:val="clear" w:color="auto" w:fill="181818"/>
+        <w:spacing w:line="270" w:lineRule="atLeast"/>
+        <w:rPr>
+          <w:rFonts w:ascii="Menlo" w:eastAsia="Times New Roman" w:hAnsi="Menlo" w:cs="Menlo"/>
+          <w:color w:val="E4E4E4"/>
+          <w:kern w:val="0"/>
+          <w:sz w:val="18"/>
+          <w:szCs w:val="18"/>
+          <w:lang w:val="en-IN" w:eastAsia="en-GB"/>
+          <w14:ligatures w14:val="none"/>
+        </w:rPr>
+      </w:pPr>
+    </w:p>
+    <w:p/>
+    <w:p>
+      <w:r>
+        <w:rPr>
+          <w:b/>
+          <w:bCs/>
+        </w:rPr>
+        <w:lastRenderedPageBreak/>
+        <w:t>Rule of thumb</w:t>
+      </w:r>
+      <w:r>
+        <w:t>: A unit test must feed the function the same shape of data it receives in production. Your parser functions all consume a list of lines, so every test for them starts by building a small list of lines.</w:t>
+      </w:r>
+    </w:p>
+    <w:p/>
+    <w:p>
+      <w:r>
+        <w:t>This is the Arrange–Act–Assert (AAA) pattern:</w:t>
+      </w:r>
+    </w:p>
+    <w:p>
+      <w:r>
+        <w:rPr>
+          <w:b/>
+          <w:bCs/>
+        </w:rPr>
+        <w:t>Arrange</w:t>
+      </w:r>
+      <w:r>
+        <w:t xml:space="preserve"> — set up the input data (your list of lines).</w:t>
+      </w:r>
+    </w:p>
+    <w:p>
+      <w:r>
+        <w:rPr>
+          <w:b/>
+          <w:bCs/>
+        </w:rPr>
+        <w:t>Act</w:t>
+      </w:r>
+      <w:r>
+        <w:t xml:space="preserve"> — call the function once, capture what it returns in result.</w:t>
+      </w:r>
+    </w:p>
+    <w:p>
+      <w:r>
+        <w:rPr>
+          <w:b/>
+          <w:bCs/>
+        </w:rPr>
+        <w:t>Assert</w:t>
+      </w:r>
+      <w:r>
+        <w:t xml:space="preserve"> — state what result should be. Green dot = it matched.</w:t>
       </w:r>
     </w:p>
     <w:sectPr>

</xml_diff>

<commit_message>
Session 12: to_dict() serialization + CSV export
</commit_message>
<xml_diff>
--- a/Blog/Network Automation Blog.docx
+++ b/Blog/Network Automation Blog.docx
@@ -2079,9 +2079,725 @@
       </w:r>
     </w:p>
     <w:p/>
+    <w:p>
+      <w:r>
+        <w:t xml:space="preserve">Try/except/else/finally: </w:t>
+      </w:r>
+    </w:p>
+    <w:p>
+      <w:r>
+        <w:t>First try (something)</w:t>
+      </w:r>
+    </w:p>
+    <w:p>
+      <w:r>
+        <w:t>Except (if try failed)</w:t>
+      </w:r>
+    </w:p>
+    <w:p>
+      <w:r>
+        <w:t>Else (do this if try suceeded)</w:t>
+      </w:r>
+    </w:p>
+    <w:p>
+      <w:r>
+        <w:t>Finally (do this regardless)</w:t>
+      </w:r>
+    </w:p>
+    <w:p/>
+    <w:p>
+      <w:r>
+        <w:t xml:space="preserve">break does not act on if statements at all. if is not a loop, so there's nothing to "break out of." break only ever targets the nearest enclosing loop — here that's the </w:t>
+      </w:r>
+      <w:proofErr w:type="gramStart"/>
+      <w:r>
+        <w:t>for j</w:t>
+      </w:r>
+      <w:proofErr w:type="gramEnd"/>
+      <w:r>
+        <w:t xml:space="preserve"> loop</w:t>
+      </w:r>
+    </w:p>
+    <w:p/>
+    <w:p>
+      <w:r>
+        <w:t xml:space="preserve">An important thing about break – the moment it gets triggered – that immediate for loop ends – loop doesn’t advance even if there could be more lines to go through. Loop keeps going to the next line in code and in body only if it hits no break. </w:t>
+      </w:r>
+    </w:p>
+    <w:p/>
+    <w:p>
+      <w:r>
+        <w:t xml:space="preserve">By naming (OSError, UnicodeDecodeError), you catch only the failures you </w:t>
+      </w:r>
+      <w:proofErr w:type="gramStart"/>
+      <w:r>
+        <w:t>actually know</w:t>
+      </w:r>
+      <w:proofErr w:type="gramEnd"/>
+      <w:r>
+        <w:t xml:space="preserve"> how to recover from ("this file is unreadable — record it and move on"), and you let everything else — bugs, Ctrl-C — fly past and surface honestly</w:t>
+      </w:r>
+      <w:r>
+        <w:t xml:space="preserve"> -loud crash</w:t>
+      </w:r>
+    </w:p>
+    <w:p/>
+    <w:p>
+      <w:r>
+        <w:rPr>
+          <w:rStyle w:val="font-semibold"/>
+          <w:rFonts w:ascii="Arial" w:hAnsi="Arial" w:cs="Arial"/>
+          <w:b/>
+          <w:bCs/>
+          <w:sz w:val="22"/>
+          <w:szCs w:val="22"/>
+          <w:shd w:val="clear" w:color="auto" w:fill="181818"/>
+        </w:rPr>
+        <w:t>Rule of thumb:</w:t>
+      </w:r>
+      <w:r>
+        <w:rPr>
+          <w:rFonts w:ascii="Arial" w:hAnsi="Arial" w:cs="Arial"/>
+          <w:sz w:val="22"/>
+          <w:szCs w:val="22"/>
+          <w:shd w:val="clear" w:color="auto" w:fill="181818"/>
+        </w:rPr>
+        <w:t> </w:t>
+      </w:r>
+      <w:r>
+        <w:rPr>
+          <w:rStyle w:val="Emphasis"/>
+          <w:rFonts w:ascii="Arial" w:hAnsi="Arial" w:cs="Arial"/>
+          <w:sz w:val="22"/>
+          <w:szCs w:val="22"/>
+          <w:shd w:val="clear" w:color="auto" w:fill="181818"/>
+        </w:rPr>
+        <w:t xml:space="preserve">catch the narrowest exception you can </w:t>
+      </w:r>
+      <w:proofErr w:type="gramStart"/>
+      <w:r>
+        <w:rPr>
+          <w:rStyle w:val="Emphasis"/>
+          <w:rFonts w:ascii="Arial" w:hAnsi="Arial" w:cs="Arial"/>
+          <w:sz w:val="22"/>
+          <w:szCs w:val="22"/>
+          <w:shd w:val="clear" w:color="auto" w:fill="181818"/>
+        </w:rPr>
+        <w:t>actually act</w:t>
+      </w:r>
+      <w:proofErr w:type="gramEnd"/>
+      <w:r>
+        <w:rPr>
+          <w:rStyle w:val="Emphasis"/>
+          <w:rFonts w:ascii="Arial" w:hAnsi="Arial" w:cs="Arial"/>
+          <w:sz w:val="22"/>
+          <w:szCs w:val="22"/>
+          <w:shd w:val="clear" w:color="auto" w:fill="181818"/>
+        </w:rPr>
+        <w:t xml:space="preserve"> on; let everything else propagate.</w:t>
+      </w:r>
+    </w:p>
+    <w:p/>
+    <w:p>
+      <w:r>
+        <w:rPr>
+          <w:highlight w:val="cyan"/>
+        </w:rPr>
+        <w:t>CLASS and OBJECTS</w:t>
+      </w:r>
+      <w:r>
+        <w:rPr>
+          <w:highlight w:val="cyan"/>
+        </w:rPr>
+        <w:t>:</w:t>
+      </w:r>
+    </w:p>
+    <w:p/>
+    <w:p>
+      <w:r>
+        <w:t>When</w:t>
+      </w:r>
+      <w:r>
+        <w:t xml:space="preserve"> you keep passing the same argument into a group of related functions, that's the universe telling </w:t>
+      </w:r>
+      <w:proofErr w:type="gramStart"/>
+      <w:r>
+        <w:t>you</w:t>
+      </w:r>
+      <w:proofErr w:type="gramEnd"/>
+      <w:r>
+        <w:t xml:space="preserve"> "make a class." Bundle the data (state) with the behavior that acts on it.</w:t>
+      </w:r>
+    </w:p>
+    <w:p/>
+    <w:p>
+      <w:r>
+        <w:lastRenderedPageBreak/>
+        <w:t>self inside the class = "me, the specific object this was called on." The data isn't shared across objects — each instance has its own attributes.</w:t>
+      </w:r>
+    </w:p>
+    <w:p/>
+    <w:p>
+      <w:r>
+        <w:rPr>
+          <w:b/>
+          <w:bCs/>
+          <w:i/>
+          <w:iCs/>
+          <w:u w:val="single"/>
+        </w:rPr>
+        <w:t>self</w:t>
+      </w:r>
+      <w:r>
+        <w:t xml:space="preserve"> — a parameter; it's how the object arrives </w:t>
+      </w:r>
+      <w:proofErr w:type="gramStart"/>
+      <w:r>
+        <w:t>into</w:t>
+      </w:r>
+      <w:proofErr w:type="gramEnd"/>
+      <w:r>
+        <w:t xml:space="preserve"> the method. Written bare because it is the object.</w:t>
+      </w:r>
+    </w:p>
+    <w:p>
+      <w:r>
+        <w:rPr>
+          <w:b/>
+          <w:bCs/>
+          <w:i/>
+          <w:iCs/>
+          <w:u w:val="single"/>
+        </w:rPr>
+        <w:t>self.data</w:t>
+      </w:r>
+      <w:r>
+        <w:t xml:space="preserve"> — has self. because data is state the object remembers beyond this call. You reach it through the object.</w:t>
+      </w:r>
+    </w:p>
+    <w:p/>
+    <w:p>
+      <w:r>
+        <w:t xml:space="preserve">Self is </w:t>
+      </w:r>
+      <w:proofErr w:type="gramStart"/>
+      <w:r>
+        <w:t>handle</w:t>
+      </w:r>
+      <w:proofErr w:type="gramEnd"/>
+      <w:r>
+        <w:t xml:space="preserve"> to the entire object. </w:t>
+      </w:r>
+    </w:p>
+    <w:p/>
+    <w:p>
+      <w:r>
+        <w:rPr>
+          <w:color w:val="E97132" w:themeColor="accent2"/>
+        </w:rPr>
+        <w:t xml:space="preserve">a </w:t>
+      </w:r>
+      <w:r>
+        <w:t xml:space="preserve">becomes self automatically. So </w:t>
+      </w:r>
+      <w:r>
+        <w:rPr>
+          <w:color w:val="E97132" w:themeColor="accent2"/>
+        </w:rPr>
+        <w:t xml:space="preserve">a.get_hostname(self) is wrong </w:t>
+      </w:r>
+      <w:r>
+        <w:t xml:space="preserve">— you </w:t>
+      </w:r>
+      <w:r>
+        <w:rPr>
+          <w:b/>
+          <w:bCs/>
+        </w:rPr>
+        <w:t>never pass self</w:t>
+      </w:r>
+      <w:r>
+        <w:t xml:space="preserve"> when calling</w:t>
+      </w:r>
+    </w:p>
+    <w:p/>
+    <w:p>
+      <w:r>
+        <w:t xml:space="preserve">self = ONLY inside the class (in the method definition – first parameter). Meaningless outside. </w:t>
+      </w:r>
+    </w:p>
+    <w:p>
+      <w:r>
+        <w:t xml:space="preserve">self.data = INSIDE the methods. To reach the object that self caught. To reach/get/call the lines. </w:t>
+      </w:r>
+    </w:p>
+    <w:p>
+      <w:proofErr w:type="gramStart"/>
+      <w:r>
+        <w:t>a.method</w:t>
+      </w:r>
+      <w:proofErr w:type="gramEnd"/>
+      <w:r>
+        <w:t xml:space="preserve">() = outside the class </w:t>
+      </w:r>
+      <w:r>
+        <w:t>(a test, build_data, __main__</w:t>
+      </w:r>
+      <w:r>
+        <w:t>), no reference of self. M</w:t>
+      </w:r>
+      <w:r>
+        <w:t>ake the object (a = GetConfig(lines)) and talk to it by its name.</w:t>
+      </w:r>
+    </w:p>
+    <w:p/>
+    <w:p>
+      <w:pPr>
+        <w:shd w:val="clear" w:color="auto" w:fill="181818"/>
+        <w:rPr>
+          <w:rFonts w:ascii="Menlo" w:eastAsia="Times New Roman" w:hAnsi="Menlo" w:cs="Menlo"/>
+          <w:kern w:val="0"/>
+          <w:sz w:val="18"/>
+          <w:szCs w:val="18"/>
+          <w:lang w:val="en-IN" w:eastAsia="en-GB"/>
+          <w14:ligatures w14:val="none"/>
+        </w:rPr>
+      </w:pPr>
+      <w:r>
+        <w:rPr>
+          <w:rFonts w:ascii="Menlo" w:eastAsia="Times New Roman" w:hAnsi="Menlo" w:cs="Menlo"/>
+          <w:kern w:val="0"/>
+          <w:sz w:val="18"/>
+          <w:szCs w:val="18"/>
+          <w:lang w:val="en-IN" w:eastAsia="en-GB"/>
+          <w14:ligatures w14:val="none"/>
+        </w:rPr>
+        <w:t xml:space="preserve">    </w:t>
+      </w:r>
+      <w:r>
+        <w:rPr>
+          <w:rFonts w:ascii="Menlo" w:eastAsia="Times New Roman" w:hAnsi="Menlo" w:cs="Menlo"/>
+          <w:color w:val="82D2CE"/>
+          <w:kern w:val="0"/>
+          <w:sz w:val="18"/>
+          <w:szCs w:val="18"/>
+          <w:lang w:val="en-IN" w:eastAsia="en-GB"/>
+          <w14:ligatures w14:val="none"/>
+        </w:rPr>
+        <w:t>def</w:t>
+      </w:r>
+      <w:r>
+        <w:rPr>
+          <w:rFonts w:ascii="Menlo" w:eastAsia="Times New Roman" w:hAnsi="Menlo" w:cs="Menlo"/>
+          <w:kern w:val="0"/>
+          <w:sz w:val="18"/>
+          <w:szCs w:val="18"/>
+          <w:lang w:val="en-IN" w:eastAsia="en-GB"/>
+          <w14:ligatures w14:val="none"/>
+        </w:rPr>
+        <w:t xml:space="preserve"> </w:t>
+      </w:r>
+      <w:r>
+        <w:rPr>
+          <w:rFonts w:ascii="Menlo" w:eastAsia="Times New Roman" w:hAnsi="Menlo" w:cs="Menlo"/>
+          <w:color w:val="EFB080"/>
+          <w:kern w:val="0"/>
+          <w:sz w:val="18"/>
+          <w:szCs w:val="18"/>
+          <w:lang w:val="en-IN" w:eastAsia="en-GB"/>
+          <w14:ligatures w14:val="none"/>
+        </w:rPr>
+        <w:t>__init__</w:t>
+      </w:r>
+      <w:r>
+        <w:rPr>
+          <w:rFonts w:ascii="Menlo" w:eastAsia="Times New Roman" w:hAnsi="Menlo" w:cs="Menlo"/>
+          <w:kern w:val="0"/>
+          <w:sz w:val="18"/>
+          <w:szCs w:val="18"/>
+          <w:lang w:val="en-IN" w:eastAsia="en-GB"/>
+          <w14:ligatures w14:val="none"/>
+        </w:rPr>
+        <w:t>(</w:t>
+      </w:r>
+      <w:r>
+        <w:rPr>
+          <w:rFonts w:ascii="Menlo" w:eastAsia="Times New Roman" w:hAnsi="Menlo" w:cs="Menlo"/>
+          <w:color w:val="D6D6DD"/>
+          <w:kern w:val="0"/>
+          <w:sz w:val="18"/>
+          <w:szCs w:val="18"/>
+          <w:lang w:val="en-IN" w:eastAsia="en-GB"/>
+          <w14:ligatures w14:val="none"/>
+        </w:rPr>
+        <w:t>self</w:t>
+      </w:r>
+      <w:r>
+        <w:rPr>
+          <w:rFonts w:ascii="Menlo" w:eastAsia="Times New Roman" w:hAnsi="Menlo" w:cs="Menlo"/>
+          <w:kern w:val="0"/>
+          <w:sz w:val="18"/>
+          <w:szCs w:val="18"/>
+          <w:lang w:val="en-IN" w:eastAsia="en-GB"/>
+          <w14:ligatures w14:val="none"/>
+        </w:rPr>
+        <w:t xml:space="preserve">, </w:t>
+      </w:r>
+      <w:r>
+        <w:rPr>
+          <w:rFonts w:ascii="Menlo" w:eastAsia="Times New Roman" w:hAnsi="Menlo" w:cs="Menlo"/>
+          <w:color w:val="D6D6DD"/>
+          <w:kern w:val="0"/>
+          <w:sz w:val="18"/>
+          <w:szCs w:val="18"/>
+          <w:lang w:val="en-IN" w:eastAsia="en-GB"/>
+          <w14:ligatures w14:val="none"/>
+        </w:rPr>
+        <w:t>lines</w:t>
+      </w:r>
+      <w:r>
+        <w:rPr>
+          <w:rFonts w:ascii="Menlo" w:eastAsia="Times New Roman" w:hAnsi="Menlo" w:cs="Menlo"/>
+          <w:kern w:val="0"/>
+          <w:sz w:val="18"/>
+          <w:szCs w:val="18"/>
+          <w:lang w:val="en-IN" w:eastAsia="en-GB"/>
+          <w14:ligatures w14:val="none"/>
+        </w:rPr>
+        <w:t xml:space="preserve">):     </w:t>
+      </w:r>
+      <w:r>
+        <w:rPr>
+          <w:rFonts w:ascii="Menlo" w:eastAsia="Times New Roman" w:hAnsi="Menlo" w:cs="Menlo"/>
+          <w:i/>
+          <w:iCs/>
+          <w:kern w:val="0"/>
+          <w:sz w:val="18"/>
+          <w:szCs w:val="18"/>
+          <w:lang w:val="en-IN" w:eastAsia="en-GB"/>
+          <w14:ligatures w14:val="none"/>
+        </w:rPr>
+        <w:t># 'lines' = incoming value, only here at birth</w:t>
+      </w:r>
+    </w:p>
+    <w:p>
+      <w:pPr>
+        <w:shd w:val="clear" w:color="auto" w:fill="181818"/>
+        <w:rPr>
+          <w:rFonts w:ascii="Menlo" w:eastAsia="Times New Roman" w:hAnsi="Menlo" w:cs="Menlo"/>
+          <w:kern w:val="0"/>
+          <w:sz w:val="18"/>
+          <w:szCs w:val="18"/>
+          <w:lang w:val="en-IN" w:eastAsia="en-GB"/>
+          <w14:ligatures w14:val="none"/>
+        </w:rPr>
+      </w:pPr>
+      <w:r>
+        <w:rPr>
+          <w:rFonts w:ascii="Menlo" w:eastAsia="Times New Roman" w:hAnsi="Menlo" w:cs="Menlo"/>
+          <w:kern w:val="0"/>
+          <w:sz w:val="18"/>
+          <w:szCs w:val="18"/>
+          <w:lang w:val="en-IN" w:eastAsia="en-GB"/>
+          <w14:ligatures w14:val="none"/>
+        </w:rPr>
+        <w:t xml:space="preserve">        </w:t>
+      </w:r>
+      <w:r>
+        <w:rPr>
+          <w:rFonts w:ascii="Menlo" w:eastAsia="Times New Roman" w:hAnsi="Menlo" w:cs="Menlo"/>
+          <w:color w:val="CC7C8A"/>
+          <w:kern w:val="0"/>
+          <w:sz w:val="18"/>
+          <w:szCs w:val="18"/>
+          <w:lang w:val="en-IN" w:eastAsia="en-GB"/>
+          <w14:ligatures w14:val="none"/>
+        </w:rPr>
+        <w:t>self</w:t>
+      </w:r>
+      <w:r>
+        <w:rPr>
+          <w:rFonts w:ascii="Menlo" w:eastAsia="Times New Roman" w:hAnsi="Menlo" w:cs="Menlo"/>
+          <w:kern w:val="0"/>
+          <w:sz w:val="18"/>
+          <w:szCs w:val="18"/>
+          <w:lang w:val="en-IN" w:eastAsia="en-GB"/>
+          <w14:ligatures w14:val="none"/>
+        </w:rPr>
+        <w:t xml:space="preserve">.data = lines          </w:t>
+      </w:r>
+      <w:r>
+        <w:rPr>
+          <w:rFonts w:ascii="Menlo" w:eastAsia="Times New Roman" w:hAnsi="Menlo" w:cs="Menlo"/>
+          <w:i/>
+          <w:iCs/>
+          <w:kern w:val="0"/>
+          <w:sz w:val="18"/>
+          <w:szCs w:val="18"/>
+          <w:lang w:val="en-IN" w:eastAsia="en-GB"/>
+          <w14:ligatures w14:val="none"/>
+        </w:rPr>
+        <w:t># store it ON the object as self.data</w:t>
+      </w:r>
+    </w:p>
+    <w:p>
+      <w:pPr>
+        <w:shd w:val="clear" w:color="auto" w:fill="181818"/>
+        <w:rPr>
+          <w:rFonts w:ascii="Menlo" w:eastAsia="Times New Roman" w:hAnsi="Menlo" w:cs="Menlo"/>
+          <w:kern w:val="0"/>
+          <w:sz w:val="18"/>
+          <w:szCs w:val="18"/>
+          <w:lang w:val="en-IN" w:eastAsia="en-GB"/>
+          <w14:ligatures w14:val="none"/>
+        </w:rPr>
+      </w:pPr>
+      <w:r>
+        <w:rPr>
+          <w:rFonts w:ascii="Menlo" w:eastAsia="Times New Roman" w:hAnsi="Menlo" w:cs="Menlo"/>
+          <w:kern w:val="0"/>
+          <w:sz w:val="18"/>
+          <w:szCs w:val="18"/>
+          <w:lang w:val="en-IN" w:eastAsia="en-GB"/>
+          <w14:ligatures w14:val="none"/>
+        </w:rPr>
+        <w:t xml:space="preserve">    </w:t>
+      </w:r>
+    </w:p>
+    <w:p>
+      <w:pPr>
+        <w:shd w:val="clear" w:color="auto" w:fill="181818"/>
+        <w:rPr>
+          <w:rFonts w:ascii="Menlo" w:eastAsia="Times New Roman" w:hAnsi="Menlo" w:cs="Menlo"/>
+          <w:kern w:val="0"/>
+          <w:sz w:val="18"/>
+          <w:szCs w:val="18"/>
+          <w:lang w:val="en-IN" w:eastAsia="en-GB"/>
+          <w14:ligatures w14:val="none"/>
+        </w:rPr>
+      </w:pPr>
+      <w:r>
+        <w:rPr>
+          <w:rFonts w:ascii="Menlo" w:eastAsia="Times New Roman" w:hAnsi="Menlo" w:cs="Menlo"/>
+          <w:kern w:val="0"/>
+          <w:sz w:val="18"/>
+          <w:szCs w:val="18"/>
+          <w:lang w:val="en-IN" w:eastAsia="en-GB"/>
+          <w14:ligatures w14:val="none"/>
+        </w:rPr>
+        <w:t xml:space="preserve">    </w:t>
+      </w:r>
+      <w:r>
+        <w:rPr>
+          <w:rFonts w:ascii="Menlo" w:eastAsia="Times New Roman" w:hAnsi="Menlo" w:cs="Menlo"/>
+          <w:color w:val="82D2CE"/>
+          <w:kern w:val="0"/>
+          <w:sz w:val="18"/>
+          <w:szCs w:val="18"/>
+          <w:lang w:val="en-IN" w:eastAsia="en-GB"/>
+          <w14:ligatures w14:val="none"/>
+        </w:rPr>
+        <w:t>def</w:t>
+      </w:r>
+      <w:r>
+        <w:rPr>
+          <w:rFonts w:ascii="Menlo" w:eastAsia="Times New Roman" w:hAnsi="Menlo" w:cs="Menlo"/>
+          <w:kern w:val="0"/>
+          <w:sz w:val="18"/>
+          <w:szCs w:val="18"/>
+          <w:lang w:val="en-IN" w:eastAsia="en-GB"/>
+          <w14:ligatures w14:val="none"/>
+        </w:rPr>
+        <w:t xml:space="preserve"> </w:t>
+      </w:r>
+      <w:r>
+        <w:rPr>
+          <w:rFonts w:ascii="Menlo" w:eastAsia="Times New Roman" w:hAnsi="Menlo" w:cs="Menlo"/>
+          <w:color w:val="EFB080"/>
+          <w:kern w:val="0"/>
+          <w:sz w:val="18"/>
+          <w:szCs w:val="18"/>
+          <w:lang w:val="en-IN" w:eastAsia="en-GB"/>
+          <w14:ligatures w14:val="none"/>
+        </w:rPr>
+        <w:t>get_hostname</w:t>
+      </w:r>
+      <w:r>
+        <w:rPr>
+          <w:rFonts w:ascii="Menlo" w:eastAsia="Times New Roman" w:hAnsi="Menlo" w:cs="Menlo"/>
+          <w:kern w:val="0"/>
+          <w:sz w:val="18"/>
+          <w:szCs w:val="18"/>
+          <w:lang w:val="en-IN" w:eastAsia="en-GB"/>
+          <w14:ligatures w14:val="none"/>
+        </w:rPr>
+        <w:t>(</w:t>
+      </w:r>
+      <w:r>
+        <w:rPr>
+          <w:rFonts w:ascii="Menlo" w:eastAsia="Times New Roman" w:hAnsi="Menlo" w:cs="Menlo"/>
+          <w:color w:val="D6D6DD"/>
+          <w:kern w:val="0"/>
+          <w:sz w:val="18"/>
+          <w:szCs w:val="18"/>
+          <w:lang w:val="en-IN" w:eastAsia="en-GB"/>
+          <w14:ligatures w14:val="none"/>
+        </w:rPr>
+        <w:t>self</w:t>
+      </w:r>
+      <w:r>
+        <w:rPr>
+          <w:rFonts w:ascii="Menlo" w:eastAsia="Times New Roman" w:hAnsi="Menlo" w:cs="Menlo"/>
+          <w:kern w:val="0"/>
+          <w:sz w:val="18"/>
+          <w:szCs w:val="18"/>
+          <w:lang w:val="en-IN" w:eastAsia="en-GB"/>
+          <w14:ligatures w14:val="none"/>
+        </w:rPr>
+        <w:t xml:space="preserve">):        </w:t>
+      </w:r>
+      <w:r>
+        <w:rPr>
+          <w:rFonts w:ascii="Menlo" w:eastAsia="Times New Roman" w:hAnsi="Menlo" w:cs="Menlo"/>
+          <w:i/>
+          <w:iCs/>
+          <w:kern w:val="0"/>
+          <w:sz w:val="18"/>
+          <w:szCs w:val="18"/>
+          <w:lang w:val="en-IN" w:eastAsia="en-GB"/>
+          <w14:ligatures w14:val="none"/>
+        </w:rPr>
+        <w:t># 'self' = the object this was called on</w:t>
+      </w:r>
+    </w:p>
+    <w:p>
+      <w:pPr>
+        <w:shd w:val="clear" w:color="auto" w:fill="181818"/>
+        <w:rPr>
+          <w:rFonts w:ascii="Menlo" w:eastAsia="Times New Roman" w:hAnsi="Menlo" w:cs="Menlo"/>
+          <w:kern w:val="0"/>
+          <w:sz w:val="18"/>
+          <w:szCs w:val="18"/>
+          <w:lang w:val="en-IN" w:eastAsia="en-GB"/>
+          <w14:ligatures w14:val="none"/>
+        </w:rPr>
+      </w:pPr>
+      <w:r>
+        <w:rPr>
+          <w:rFonts w:ascii="Menlo" w:eastAsia="Times New Roman" w:hAnsi="Menlo" w:cs="Menlo"/>
+          <w:kern w:val="0"/>
+          <w:sz w:val="18"/>
+          <w:szCs w:val="18"/>
+          <w:lang w:val="en-IN" w:eastAsia="en-GB"/>
+          <w14:ligatures w14:val="none"/>
+        </w:rPr>
+        <w:t xml:space="preserve">        </w:t>
+      </w:r>
+      <w:r>
+        <w:rPr>
+          <w:rFonts w:ascii="Menlo" w:eastAsia="Times New Roman" w:hAnsi="Menlo" w:cs="Menlo"/>
+          <w:color w:val="82D2CE"/>
+          <w:kern w:val="0"/>
+          <w:sz w:val="18"/>
+          <w:szCs w:val="18"/>
+          <w:lang w:val="en-IN" w:eastAsia="en-GB"/>
+          <w14:ligatures w14:val="none"/>
+        </w:rPr>
+        <w:t>for</w:t>
+      </w:r>
+      <w:r>
+        <w:rPr>
+          <w:rFonts w:ascii="Menlo" w:eastAsia="Times New Roman" w:hAnsi="Menlo" w:cs="Menlo"/>
+          <w:kern w:val="0"/>
+          <w:sz w:val="18"/>
+          <w:szCs w:val="18"/>
+          <w:lang w:val="en-IN" w:eastAsia="en-GB"/>
+          <w14:ligatures w14:val="none"/>
+        </w:rPr>
+        <w:t xml:space="preserve"> line </w:t>
+      </w:r>
+      <w:r>
+        <w:rPr>
+          <w:rFonts w:ascii="Menlo" w:eastAsia="Times New Roman" w:hAnsi="Menlo" w:cs="Menlo"/>
+          <w:color w:val="82D2CE"/>
+          <w:kern w:val="0"/>
+          <w:sz w:val="18"/>
+          <w:szCs w:val="18"/>
+          <w:lang w:val="en-IN" w:eastAsia="en-GB"/>
+          <w14:ligatures w14:val="none"/>
+        </w:rPr>
+        <w:t>in</w:t>
+      </w:r>
+      <w:r>
+        <w:rPr>
+          <w:rFonts w:ascii="Menlo" w:eastAsia="Times New Roman" w:hAnsi="Menlo" w:cs="Menlo"/>
+          <w:kern w:val="0"/>
+          <w:sz w:val="18"/>
+          <w:szCs w:val="18"/>
+          <w:lang w:val="en-IN" w:eastAsia="en-GB"/>
+          <w14:ligatures w14:val="none"/>
+        </w:rPr>
+        <w:t xml:space="preserve"> </w:t>
+      </w:r>
+      <w:r>
+        <w:rPr>
+          <w:rFonts w:ascii="Menlo" w:eastAsia="Times New Roman" w:hAnsi="Menlo" w:cs="Menlo"/>
+          <w:color w:val="CC7C8A"/>
+          <w:kern w:val="0"/>
+          <w:sz w:val="18"/>
+          <w:szCs w:val="18"/>
+          <w:lang w:val="en-IN" w:eastAsia="en-GB"/>
+          <w14:ligatures w14:val="none"/>
+        </w:rPr>
+        <w:t>self</w:t>
+      </w:r>
+      <w:r>
+        <w:rPr>
+          <w:rFonts w:ascii="Menlo" w:eastAsia="Times New Roman" w:hAnsi="Menlo" w:cs="Menlo"/>
+          <w:kern w:val="0"/>
+          <w:sz w:val="18"/>
+          <w:szCs w:val="18"/>
+          <w:lang w:val="en-IN" w:eastAsia="en-GB"/>
+          <w14:ligatures w14:val="none"/>
+        </w:rPr>
+        <w:t xml:space="preserve">.data:     </w:t>
+      </w:r>
+      <w:r>
+        <w:rPr>
+          <w:rFonts w:ascii="Menlo" w:eastAsia="Times New Roman" w:hAnsi="Menlo" w:cs="Menlo"/>
+          <w:i/>
+          <w:iCs/>
+          <w:kern w:val="0"/>
+          <w:sz w:val="18"/>
+          <w:szCs w:val="18"/>
+          <w:lang w:val="en-IN" w:eastAsia="en-GB"/>
+          <w14:ligatures w14:val="none"/>
+        </w:rPr>
+        <w:t># reach the stored lines via self.data ('lines' is GONE here)</w:t>
+      </w:r>
+    </w:p>
     <w:p/>
     <w:p/>
-    <w:p/>
+    <w:p>
+      <w:r>
+        <w:rPr>
+          <w:color w:val="E97132" w:themeColor="accent2"/>
+        </w:rPr>
+        <w:t xml:space="preserve">self.data </w:t>
+      </w:r>
+      <w:r>
+        <w:t xml:space="preserve">and </w:t>
+      </w:r>
+      <w:r>
+        <w:rPr>
+          <w:color w:val="E97132" w:themeColor="accent2"/>
+        </w:rPr>
+        <w:t xml:space="preserve">a.data </w:t>
+      </w:r>
+      <w:r>
+        <w:t>are the same attribute seen from two sides — self.data from inside the class, a.data from outside. self and a are two names for one object: the inside-name and the outside-name.</w:t>
+      </w:r>
+    </w:p>
     <w:p/>
     <w:sectPr>
       <w:footerReference w:type="even" r:id="rId6"/>
@@ -3452,6 +4168,22 @@
     <w:uiPriority w:val="99"/>
     <w:rsid w:val="00DF1E6D"/>
   </w:style>
+  <w:style w:type="character" w:customStyle="1" w:styleId="font-semibold">
+    <w:name w:val="font-semibold"/>
+    <w:basedOn w:val="DefaultParagraphFont"/>
+    <w:rsid w:val="00921FB0"/>
+  </w:style>
+  <w:style w:type="character" w:styleId="Emphasis">
+    <w:name w:val="Emphasis"/>
+    <w:basedOn w:val="DefaultParagraphFont"/>
+    <w:uiPriority w:val="20"/>
+    <w:qFormat/>
+    <w:rsid w:val="00921FB0"/>
+    <w:rPr>
+      <w:i/>
+      <w:iCs/>
+    </w:rPr>
+  </w:style>
 </w:styles>
 </file>
 

</xml_diff>